<commit_message>
docs: the one-title-one-profession decision, for marketing to confirm
7.1 is no longer an open design question. Merve decided on 30 October that a
title naming two jobs stays where it is - 47,000 records saying teaching AND
research and 31,000 saying teaching AND leadership all stay in Lecturer. It is
written up as a decision for marketing to confirm rather than a question, with
what it costs them stated plainly: a professor who runs a research group is in
Lecturer and not Researcher.

7.1a is new and is genuinely open. The same compound titles are split between
Lecturer and Head of Faculty by WORD ORDER - 'professor and director' goes one
way, 'professor & director' the other, on margins of 0.004. 68,000 records.
One rule has to cover them and it costs 24,000 records from Head of Faculty or
44,000 from Lecturer. We recommend Head of Faculty and say why.

Co-Authored-By: Claude Opus 5 (1M context) <noreply@anthropic.com>
</commit_message>
<xml_diff>
--- a/orcid_role_identifier/docs/ORCID-Questions-for-Marketing.docx
+++ b/orcid_role_identifier/docs/ORCID-Questions-for-Marketing.docx
@@ -1512,7 +1512,7 @@
                 <w:color w:val="464B52"/>
                 <w:sz w:val="17"/>
               </w:rPr>
-              <w:t>463,603 records</w:t>
+              <w:t>78,000 records</w:t>
             </w:r>
           </w:p>
         </w:tc>
@@ -1527,11 +1527,20 @@
             <w:r>
               <w:rPr>
                 <w:rFonts w:ascii="Calibri" w:hAnsi="Calibri"/>
+                <w:b/>
+                <w:color w:val="464B52"/>
+                <w:sz w:val="17"/>
+              </w:rPr>
+              <w:t>DECIDED — no.</w:t>
+            </w:r>
+            <w:r>
+              <w:rPr>
+                <w:rFonts w:ascii="Calibri" w:hAnsi="Calibri"/>
                 <w:b w:val="0"/>
                 <w:color w:val="464B52"/>
                 <w:sz w:val="17"/>
               </w:rPr>
-              <w:t>No (design change)</w:t>
+              <w:t xml:space="preserve"> Please confirm</w:t>
             </w:r>
           </w:p>
         </w:tc>
@@ -1546,20 +1555,11 @@
             <w:r>
               <w:rPr>
                 <w:rFonts w:ascii="Calibri" w:hAnsi="Calibri"/>
-                <w:b/>
-                <w:color w:val="464B52"/>
-                <w:sz w:val="17"/>
-              </w:rPr>
-              <w:t>High</w:t>
-            </w:r>
-            <w:r>
-              <w:rPr>
-                <w:rFonts w:ascii="Calibri" w:hAnsi="Calibri"/>
                 <w:b w:val="0"/>
                 <w:color w:val="464B52"/>
                 <w:sz w:val="17"/>
               </w:rPr>
-              <w:t xml:space="preserve"> — now externally evidenced</w:t>
+              <w:t>Confirm</w:t>
             </w:r>
           </w:p>
         </w:tc>
@@ -6530,7 +6530,7 @@
           <w:color w:val="1F6F6A"/>
           <w:sz w:val="25"/>
         </w:rPr>
-        <w:t>7.1  Should a job title be allowed in two professions?  (463,603 records)</w:t>
+        <w:t>7.1  A title stays in ONE profession — DECIDED 30 October, please confirm</w:t>
       </w:r>
     </w:p>
     <w:p>
@@ -6545,7 +6545,7 @@
           <w:color w:val="464B52"/>
           <w:sz w:val="21"/>
         </w:rPr>
-        <w:t xml:space="preserve">A title belongs to exactly one profession today. That is a design choice and it has a measurable cost. </w:t>
+        <w:t xml:space="preserve">A title belongs to exactly one profession today. Some people write both jobs into one title, and we have to choose. </w:t>
       </w:r>
       <w:r>
         <w:rPr>
@@ -6555,7 +6555,258 @@
           <w:color w:val="464B52"/>
           <w:sz w:val="21"/>
         </w:rPr>
-        <w:t>This moved from low priority to high on 30 October, when an outside source measured the cost for the first time.</w:t>
+        <w:t>We decided on 30 October to leave them where they are, and we would like you to confirm it.</w:t>
+      </w:r>
+    </w:p>
+    <w:tbl>
+      <w:tblPr>
+        <w:tblStyle w:val="TableGrid"/>
+        <w:tblW w:type="auto" w:w="0"/>
+        <w:jc w:val="left"/>
+        <w:tblLook w:firstColumn="1" w:firstRow="1" w:lastColumn="0" w:lastRow="0" w:noHBand="0" w:noVBand="1" w:val="04A0"/>
+      </w:tblPr>
+      <w:tblGrid>
+        <w:gridCol w:w="3216"/>
+        <w:gridCol w:w="3216"/>
+        <w:gridCol w:w="3216"/>
+      </w:tblGrid>
+      <w:tr>
+        <w:tc>
+          <w:tcPr>
+            <w:tcW w:type="dxa" w:w="5184"/>
+            <w:shd w:val="clear" w:fill="1C1F23"/>
+          </w:tcPr>
+          <w:p>
+            <w:pPr>
+              <w:spacing w:after="20"/>
+            </w:pPr>
+            <w:r>
+              <w:rPr>
+                <w:rFonts w:ascii="Calibri" w:hAnsi="Calibri"/>
+                <w:b/>
+                <w:color w:val="FFFFFF"/>
+                <w:sz w:val="17"/>
+              </w:rPr>
+              <w:t>What the person wrote</w:t>
+            </w:r>
+          </w:p>
+        </w:tc>
+        <w:tc>
+          <w:tcPr>
+            <w:tcW w:type="dxa" w:w="1296"/>
+            <w:shd w:val="clear" w:fill="1C1F23"/>
+          </w:tcPr>
+          <w:p>
+            <w:pPr>
+              <w:spacing w:after="20"/>
+            </w:pPr>
+            <w:r>
+              <w:rPr>
+                <w:rFonts w:ascii="Calibri" w:hAnsi="Calibri"/>
+                <w:b/>
+                <w:color w:val="FFFFFF"/>
+                <w:sz w:val="17"/>
+              </w:rPr>
+              <w:t>Records</w:t>
+            </w:r>
+          </w:p>
+        </w:tc>
+        <w:tc>
+          <w:tcPr>
+            <w:tcW w:type="dxa" w:w="2736"/>
+            <w:shd w:val="clear" w:fill="1C1F23"/>
+          </w:tcPr>
+          <w:p>
+            <w:pPr>
+              <w:spacing w:after="20"/>
+            </w:pPr>
+            <w:r>
+              <w:rPr>
+                <w:rFonts w:ascii="Calibri" w:hAnsi="Calibri"/>
+                <w:b/>
+                <w:color w:val="FFFFFF"/>
+                <w:sz w:val="17"/>
+              </w:rPr>
+              <w:t>Our decision</w:t>
+            </w:r>
+          </w:p>
+        </w:tc>
+      </w:tr>
+      <w:tr>
+        <w:tc>
+          <w:tcPr>
+            <w:tcW w:type="dxa" w:w="5184"/>
+          </w:tcPr>
+          <w:p>
+            <w:pPr>
+              <w:spacing w:after="20"/>
+            </w:pPr>
+            <w:r>
+              <w:rPr>
+                <w:rFonts w:ascii="Calibri" w:hAnsi="Calibri"/>
+                <w:b w:val="0"/>
+                <w:color w:val="464B52"/>
+                <w:sz w:val="19"/>
+              </w:rPr>
+              <w:t>Teaching AND research — *lecturer and researcher*, *teaching and research*, *assistant professor research*</w:t>
+            </w:r>
+          </w:p>
+        </w:tc>
+        <w:tc>
+          <w:tcPr>
+            <w:tcW w:type="dxa" w:w="1296"/>
+          </w:tcPr>
+          <w:p>
+            <w:pPr>
+              <w:spacing w:after="20"/>
+            </w:pPr>
+            <w:r>
+              <w:rPr>
+                <w:rFonts w:ascii="Calibri" w:hAnsi="Calibri"/>
+                <w:b/>
+                <w:color w:val="464B52"/>
+                <w:sz w:val="19"/>
+              </w:rPr>
+              <w:t>~47,000</w:t>
+            </w:r>
+          </w:p>
+        </w:tc>
+        <w:tc>
+          <w:tcPr>
+            <w:tcW w:type="dxa" w:w="2736"/>
+          </w:tcPr>
+          <w:p>
+            <w:pPr>
+              <w:spacing w:after="20"/>
+            </w:pPr>
+            <w:r>
+              <w:rPr>
+                <w:rFonts w:ascii="Calibri" w:hAnsi="Calibri"/>
+                <w:b/>
+                <w:color w:val="464B52"/>
+                <w:sz w:val="19"/>
+              </w:rPr>
+              <w:t>Stay in Lecturer</w:t>
+            </w:r>
+          </w:p>
+        </w:tc>
+      </w:tr>
+      <w:tr>
+        <w:tc>
+          <w:tcPr>
+            <w:tcW w:type="dxa" w:w="5184"/>
+            <w:shd w:val="clear" w:fill="F7F7F6"/>
+          </w:tcPr>
+          <w:p>
+            <w:pPr>
+              <w:spacing w:after="20"/>
+            </w:pPr>
+            <w:r>
+              <w:rPr>
+                <w:rFonts w:ascii="Calibri" w:hAnsi="Calibri"/>
+                <w:b w:val="0"/>
+                <w:color w:val="464B52"/>
+                <w:sz w:val="19"/>
+              </w:rPr>
+              <w:t>Teaching AND leadership — *professor and chair*, *professor and head*, *professor and dean*</w:t>
+            </w:r>
+          </w:p>
+        </w:tc>
+        <w:tc>
+          <w:tcPr>
+            <w:tcW w:type="dxa" w:w="1296"/>
+            <w:shd w:val="clear" w:fill="F7F7F6"/>
+          </w:tcPr>
+          <w:p>
+            <w:pPr>
+              <w:spacing w:after="20"/>
+            </w:pPr>
+            <w:r>
+              <w:rPr>
+                <w:rFonts w:ascii="Calibri" w:hAnsi="Calibri"/>
+                <w:b/>
+                <w:color w:val="464B52"/>
+                <w:sz w:val="19"/>
+              </w:rPr>
+              <w:t>~31,000</w:t>
+            </w:r>
+          </w:p>
+        </w:tc>
+        <w:tc>
+          <w:tcPr>
+            <w:tcW w:type="dxa" w:w="2736"/>
+            <w:shd w:val="clear" w:fill="F7F7F6"/>
+          </w:tcPr>
+          <w:p>
+            <w:pPr>
+              <w:spacing w:after="20"/>
+            </w:pPr>
+            <w:r>
+              <w:rPr>
+                <w:rFonts w:ascii="Calibri" w:hAnsi="Calibri"/>
+                <w:b/>
+                <w:color w:val="464B52"/>
+                <w:sz w:val="19"/>
+              </w:rPr>
+              <w:t>Stay in Lecturer</w:t>
+            </w:r>
+          </w:p>
+        </w:tc>
+      </w:tr>
+    </w:tbl>
+    <w:p>
+      <w:pPr>
+        <w:spacing w:after="40"/>
+      </w:pPr>
+    </w:p>
+    <w:p>
+      <w:pPr>
+        <w:spacing w:after="120"/>
+      </w:pPr>
+      <w:r>
+        <w:rPr>
+          <w:rFonts w:ascii="Calibri" w:hAnsi="Calibri"/>
+          <w:b/>
+          <w:i w:val="0"/>
+          <w:color w:val="464B52"/>
+          <w:sz w:val="21"/>
+        </w:rPr>
+        <w:t>Why.</w:t>
+      </w:r>
+      <w:r>
+        <w:rPr>
+          <w:rFonts w:ascii="Calibri" w:hAnsi="Calibri"/>
+          <w:b w:val="0"/>
+          <w:i w:val="0"/>
+          <w:color w:val="464B52"/>
+          <w:sz w:val="21"/>
+        </w:rPr>
+        <w:t xml:space="preserve"> Letting one title carry two professions is a change to how the system is built, not a setting. 78,000 records is not enough to justify it, and in both cases Lecturer is a defensible home: these people do teach.</w:t>
+      </w:r>
+    </w:p>
+    <w:p>
+      <w:pPr>
+        <w:spacing w:after="120"/>
+      </w:pPr>
+      <w:r>
+        <w:rPr>
+          <w:rFonts w:ascii="Calibri" w:hAnsi="Calibri"/>
+          <w:b/>
+          <w:i w:val="0"/>
+          <w:color w:val="464B52"/>
+          <w:sz w:val="21"/>
+        </w:rPr>
+        <w:t>What it costs you.</w:t>
+      </w:r>
+      <w:r>
+        <w:rPr>
+          <w:rFonts w:ascii="Calibri" w:hAnsi="Calibri"/>
+          <w:b w:val="0"/>
+          <w:i w:val="0"/>
+          <w:color w:val="464B52"/>
+          <w:sz w:val="21"/>
+        </w:rPr>
+        <w:t xml:space="preserve"> A professor who also runs a research group is in the Lecturer audience and not in Researcher. A professor who also heads a department is in Lecturer and not in Head of Faculty. If either of those matters for a campaign, tell us and we will reopen it.</w:t>
       </w:r>
     </w:p>
     <w:tbl>
@@ -6909,6 +7160,302 @@
       <w:pPr>
         <w:spacing w:after="40"/>
       </w:pPr>
+    </w:p>
+    <w:p>
+      <w:pPr>
+        <w:keepNext/>
+        <w:spacing w:before="280" w:after="80"/>
+      </w:pPr>
+      <w:r>
+        <w:rPr>
+          <w:rFonts w:ascii="Calibri" w:hAnsi="Calibri"/>
+          <w:b/>
+          <w:color w:val="1F6F6A"/>
+          <w:sz w:val="25"/>
+        </w:rPr>
+        <w:t>7.1a  NEW — and one part of it is NOT settled</w:t>
+      </w:r>
+    </w:p>
+    <w:p>
+      <w:pPr>
+        <w:spacing w:after="120"/>
+      </w:pPr>
+      <w:r>
+        <w:rPr>
+          <w:rFonts w:ascii="Calibri" w:hAnsi="Calibri"/>
+          <w:b w:val="0"/>
+          <w:i w:val="0"/>
+          <w:color w:val="464B52"/>
+          <w:sz w:val="21"/>
+        </w:rPr>
+        <w:t xml:space="preserve">Measured the same day. Those compound titles are currently split between the teaching group and the leadership group </w:t>
+      </w:r>
+      <w:r>
+        <w:rPr>
+          <w:rFonts w:ascii="Calibri" w:hAnsi="Calibri"/>
+          <w:b/>
+          <w:i w:val="0"/>
+          <w:color w:val="464B52"/>
+          <w:sz w:val="21"/>
+        </w:rPr>
+        <w:t>by word order</w:t>
+      </w:r>
+      <w:r>
+        <w:rPr>
+          <w:rFonts w:ascii="Calibri" w:hAnsi="Calibri"/>
+          <w:b w:val="0"/>
+          <w:i w:val="0"/>
+          <w:color w:val="464B52"/>
+          <w:sz w:val="21"/>
+        </w:rPr>
+        <w:t>, which cannot be defended whichever way you answer.</w:t>
+      </w:r>
+    </w:p>
+    <w:tbl>
+      <w:tblPr>
+        <w:tblW w:type="auto" w:w="0"/>
+        <w:jc w:val="left"/>
+        <w:tblLook w:firstColumn="1" w:firstRow="1" w:lastColumn="0" w:lastRow="0" w:noHBand="0" w:noVBand="1" w:val="04A0"/>
+        <w:tblBorders>
+          <w:top w:val="none" w:sz="0"/>
+          <w:left w:val="none" w:sz="0"/>
+          <w:bottom w:val="none" w:sz="0"/>
+          <w:right w:val="none" w:sz="0"/>
+          <w:insideH w:val="none" w:sz="0"/>
+          <w:insideV w:val="none" w:sz="0"/>
+        </w:tblBorders>
+      </w:tblPr>
+      <w:tblGrid>
+        <w:gridCol w:w="9648"/>
+      </w:tblGrid>
+      <w:tr>
+        <w:tc>
+          <w:tcPr>
+            <w:tcW w:type="dxa" w:w="9648"/>
+            <w:shd w:val="clear" w:fill="F2F6F5"/>
+          </w:tcPr>
+          <w:p>
+            <w:pPr>
+              <w:spacing w:after="60"/>
+            </w:pPr>
+            <w:r>
+              <w:rPr>
+                <w:rFonts w:ascii="Calibri" w:hAnsi="Calibri"/>
+                <w:b/>
+                <w:color w:val="1F6F6A"/>
+                <w:sz w:val="19"/>
+              </w:rPr>
+              <w:t>THE SAME TWO WORDS, FOUR DIFFERENT ANSWERS</w:t>
+            </w:r>
+          </w:p>
+          <w:p>
+            <w:pPr>
+              <w:spacing w:after="40"/>
+            </w:pPr>
+            <w:r>
+              <w:rPr>
+                <w:rFonts w:ascii="Consolas" w:hAnsi="Consolas"/>
+                <w:b w:val="0"/>
+                <w:color w:val="1C1F23"/>
+                <w:sz w:val="19"/>
+              </w:rPr>
+              <w:t>professor and director   4,601  -&gt;  Head of Faculty</w:t>
+            </w:r>
+          </w:p>
+          <w:p>
+            <w:pPr>
+              <w:spacing w:after="40"/>
+            </w:pPr>
+            <w:r>
+              <w:rPr>
+                <w:rFonts w:ascii="Consolas" w:hAnsi="Consolas"/>
+                <w:b w:val="0"/>
+                <w:color w:val="1C1F23"/>
+                <w:sz w:val="19"/>
+              </w:rPr>
+              <w:t>professor &amp; director     2,185  -&gt;  Lecturer</w:t>
+            </w:r>
+          </w:p>
+          <w:p>
+            <w:pPr>
+              <w:spacing w:after="40"/>
+            </w:pPr>
+            <w:r>
+              <w:rPr>
+                <w:rFonts w:ascii="Consolas" w:hAnsi="Consolas"/>
+                <w:b w:val="0"/>
+                <w:color w:val="1C1F23"/>
+                <w:sz w:val="19"/>
+              </w:rPr>
+              <w:t>professor director       2,140  -&gt;  Lecturer</w:t>
+            </w:r>
+          </w:p>
+          <w:p>
+            <w:pPr>
+              <w:spacing w:after="40"/>
+            </w:pPr>
+            <w:r>
+              <w:rPr>
+                <w:rFonts w:ascii="Consolas" w:hAnsi="Consolas"/>
+                <w:b w:val="0"/>
+                <w:color w:val="1C1F23"/>
+                <w:sz w:val="19"/>
+              </w:rPr>
+              <w:t>director professor       1,110  -&gt;  Head of Faculty</w:t>
+            </w:r>
+          </w:p>
+          <w:p>
+            <w:pPr>
+              <w:spacing w:after="40"/>
+            </w:pPr>
+            <w:r>
+              <w:rPr>
+                <w:rFonts w:ascii="Consolas" w:hAnsi="Consolas"/>
+                <w:b w:val="0"/>
+                <w:color w:val="1C1F23"/>
+                <w:sz w:val="19"/>
+              </w:rPr>
+              <w:t>director/professor       2,033  -&gt;  Head of Faculty</w:t>
+            </w:r>
+          </w:p>
+          <w:p>
+            <w:pPr>
+              <w:spacing w:after="40"/>
+            </w:pPr>
+            <w:r>
+              <w:rPr>
+                <w:rFonts w:ascii="Consolas" w:hAnsi="Consolas"/>
+                <w:b w:val="0"/>
+                <w:color w:val="1C1F23"/>
+                <w:sz w:val="19"/>
+              </w:rPr>
+              <w:t>professor/director       1,256  -&gt;  Lecturer</w:t>
+            </w:r>
+          </w:p>
+          <w:p>
+            <w:pPr>
+              <w:spacing w:after="40"/>
+            </w:pPr>
+          </w:p>
+          <w:p>
+            <w:pPr>
+              <w:spacing w:after="40"/>
+            </w:pPr>
+            <w:r>
+              <w:rPr>
+                <w:rFonts w:ascii="Calibri" w:hAnsi="Calibri"/>
+                <w:b w:val="0"/>
+                <w:color w:val="464B52"/>
+                <w:sz w:val="20"/>
+              </w:rPr>
+              <w:t xml:space="preserve">The only thing separating them is the separator and the order. About </w:t>
+            </w:r>
+            <w:r>
+              <w:rPr>
+                <w:rFonts w:ascii="Calibri" w:hAnsi="Calibri"/>
+                <w:b/>
+                <w:color w:val="464B52"/>
+                <w:sz w:val="20"/>
+              </w:rPr>
+              <w:t>68,000 records</w:t>
+            </w:r>
+            <w:r>
+              <w:rPr>
+                <w:rFonts w:ascii="Calibri" w:hAnsi="Calibri"/>
+                <w:b w:val="0"/>
+                <w:color w:val="464B52"/>
+                <w:sz w:val="20"/>
+              </w:rPr>
+              <w:t xml:space="preserve"> in total: 44,000 currently in Lecturer, 24,000 in Head of Faculty.</w:t>
+            </w:r>
+          </w:p>
+        </w:tc>
+      </w:tr>
+    </w:tbl>
+    <w:p>
+      <w:pPr>
+        <w:spacing w:after="40"/>
+      </w:pPr>
+    </w:p>
+    <w:p>
+      <w:pPr>
+        <w:spacing w:after="120"/>
+      </w:pPr>
+      <w:r>
+        <w:rPr>
+          <w:rFonts w:ascii="Calibri" w:hAnsi="Calibri"/>
+          <w:b w:val="0"/>
+          <w:i w:val="0"/>
+          <w:color w:val="464B52"/>
+          <w:sz w:val="21"/>
+        </w:rPr>
+        <w:t xml:space="preserve">One rule has to cover all of them, and it costs something either way. Sending them all to </w:t>
+      </w:r>
+      <w:r>
+        <w:rPr>
+          <w:rFonts w:ascii="Calibri" w:hAnsi="Calibri"/>
+          <w:b/>
+          <w:i w:val="0"/>
+          <w:color w:val="464B52"/>
+          <w:sz w:val="21"/>
+        </w:rPr>
+        <w:t>Lecturer</w:t>
+      </w:r>
+      <w:r>
+        <w:rPr>
+          <w:rFonts w:ascii="Calibri" w:hAnsi="Calibri"/>
+          <w:b w:val="0"/>
+          <w:i w:val="0"/>
+          <w:color w:val="464B52"/>
+          <w:sz w:val="21"/>
+        </w:rPr>
+        <w:t xml:space="preserve"> removes 24,000 records from Head of Faculty, which is already our weakest audience. Sending them all to </w:t>
+      </w:r>
+      <w:r>
+        <w:rPr>
+          <w:rFonts w:ascii="Calibri" w:hAnsi="Calibri"/>
+          <w:b/>
+          <w:i w:val="0"/>
+          <w:color w:val="464B52"/>
+          <w:sz w:val="21"/>
+        </w:rPr>
+        <w:t>Head of Faculty</w:t>
+      </w:r>
+      <w:r>
+        <w:rPr>
+          <w:rFonts w:ascii="Calibri" w:hAnsi="Calibri"/>
+          <w:b w:val="0"/>
+          <w:i w:val="0"/>
+          <w:color w:val="464B52"/>
+          <w:sz w:val="21"/>
+        </w:rPr>
+        <w:t xml:space="preserve"> removes 44,000 from Lecturer — 0.4% of a group of twelve million.</w:t>
+      </w:r>
+    </w:p>
+    <w:p>
+      <w:pPr>
+        <w:spacing w:after="120"/>
+      </w:pPr>
+      <w:r>
+        <w:rPr>
+          <w:rFonts w:ascii="Calibri" w:hAnsi="Calibri"/>
+          <w:b/>
+          <w:i w:val="0"/>
+          <w:color w:val="464B52"/>
+          <w:sz w:val="21"/>
+        </w:rPr>
+        <w:t>Our recommendation is Head of Faculty</w:t>
+      </w:r>
+      <w:r>
+        <w:rPr>
+          <w:rFonts w:ascii="Calibri" w:hAnsi="Calibri"/>
+          <w:b w:val="0"/>
+          <w:i w:val="0"/>
+          <w:color w:val="464B52"/>
+          <w:sz w:val="21"/>
+        </w:rPr>
+        <w:t>, because Lecturer is large enough not to notice and Head of Faculty is small, precise and currently missing people whose title literally says they head something. But the question is which audience you would rather reach them in.</w:t>
+      </w:r>
     </w:p>
     <w:p>
       <w:pPr>
@@ -7625,6 +8172,77 @@
                 <w:sz w:val="17"/>
               </w:rPr>
               <w:t>29 Oct</w:t>
+            </w:r>
+          </w:p>
+        </w:tc>
+      </w:tr>
+      <w:tr>
+        <w:tc>
+          <w:tcPr>
+            <w:tcW w:type="dxa" w:w="4320"/>
+            <w:shd w:val="clear" w:fill="F7F7F6"/>
+          </w:tcPr>
+          <w:p>
+            <w:pPr>
+              <w:spacing w:after="20"/>
+            </w:pPr>
+            <w:r>
+              <w:rPr>
+                <w:rFonts w:ascii="Calibri" w:hAnsi="Calibri"/>
+                <w:b w:val="0"/>
+                <w:color w:val="464B52"/>
+                <w:sz w:val="17"/>
+              </w:rPr>
+              <w:t>Should a title that names two jobs count as both? (78,000 records)</w:t>
+            </w:r>
+          </w:p>
+        </w:tc>
+        <w:tc>
+          <w:tcPr>
+            <w:tcW w:type="dxa" w:w="3312"/>
+            <w:shd w:val="clear" w:fill="F7F7F6"/>
+          </w:tcPr>
+          <w:p>
+            <w:pPr>
+              <w:spacing w:after="20"/>
+            </w:pPr>
+            <w:r>
+              <w:rPr>
+                <w:rFonts w:ascii="Calibri" w:hAnsi="Calibri"/>
+                <w:b/>
+                <w:color w:val="464B52"/>
+                <w:sz w:val="17"/>
+              </w:rPr>
+              <w:t>No.</w:t>
+            </w:r>
+            <w:r>
+              <w:rPr>
+                <w:rFonts w:ascii="Calibri" w:hAnsi="Calibri"/>
+                <w:b w:val="0"/>
+                <w:color w:val="464B52"/>
+                <w:sz w:val="17"/>
+              </w:rPr>
+              <w:t xml:space="preserve"> They stay in Lecturer. See 7.1 — please confirm.</w:t>
+            </w:r>
+          </w:p>
+        </w:tc>
+        <w:tc>
+          <w:tcPr>
+            <w:tcW w:type="dxa" w:w="1296"/>
+            <w:shd w:val="clear" w:fill="F7F7F6"/>
+          </w:tcPr>
+          <w:p>
+            <w:pPr>
+              <w:spacing w:after="20"/>
+            </w:pPr>
+            <w:r>
+              <w:rPr>
+                <w:rFonts w:ascii="Calibri" w:hAnsi="Calibri"/>
+                <w:b w:val="0"/>
+                <w:color w:val="464B52"/>
+                <w:sz w:val="17"/>
+              </w:rPr>
+              <w:t>30 Oct</w:t>
             </w:r>
           </w:p>
         </w:tc>

</xml_diff>